<commit_message>
Sprint 2: Ficha con enlace a la Retrospectiva
Co-Authored-By: Claude Sonnet 5.5 <noreply@anthropic.com>
Claude-Session: https://claude.ai/code/session_01PNf66jJFaujFG7BHCQCzXL
</commit_message>
<xml_diff>
--- a/04_Documentacion/Ficha_de_Seguimiento_y_Evaluacion_Sprint2.docx
+++ b/04_Documentacion/Ficha_de_Seguimiento_y_Evaluacion_Sprint2.docx
@@ -3429,8 +3429,23 @@
                 <w:szCs w:val="13"/>
                 <w:rtl w:val="0"/>
               </w:rPr>
-              <w:t xml:space="preserve">Acceso al documento de retrospectiva y aprendizajes.  Enlace: [pegar enlace de la Retrospectiva del Sprint 2]</w:t>
-            </w:r>
+              <w:t xml:space="preserve">Acceso al documento de retrospectiva y aprendizajes.  Enlace: </w:t>
+            </w:r>
+            <w:hyperlink r:id="rId17">
+              <w:r>
+                <w:rPr>
+                  <w:rFonts w:ascii="Arial" w:cs="Arial" w:eastAsia="Arial" w:hAnsi="Arial"/>
+                  <w:b w:val="1"/>
+                  <w:bCs w:val="1"/>
+                  <w:color w:val="1155cc"/>
+                  <w:sz w:val="13"/>
+                  <w:szCs w:val="13"/>
+                  <w:u w:val="single"/>
+                  <w:rtl w:val="0"/>
+                </w:rPr>
+                <w:t xml:space="preserve">https://drive.google.com/file/d/1zdEPJTt1NDCcQYOU6eihFzkMY4oENdMm/view</w:t>
+              </w:r>
+            </w:hyperlink>
             <w:r>
               <w:rPr>
                 <w:rFonts w:ascii="Arial" w:cs="Arial" w:eastAsia="Arial" w:hAnsi="Arial"/>

</xml_diff>